<commit_message>
updated abstract to feedback
</commit_message>
<xml_diff>
--- a/MP2526_INF_abstract_Gielkens.docx
+++ b/MP2526_INF_abstract_Gielkens.docx
@@ -102,8 +102,72 @@
                                 <w:sz w:val="22"/>
                                 <w:szCs w:val="22"/>
                               </w:rPr>
-                              <w:t>Prof. dr. ir. Koen Yskout (KULeuven), Dr. Eva Geurts (EDM), KULeuven/UHasselt</w:t>
+                              <w:t xml:space="preserve">Prof. dr. ir. Koen </w:t>
                             </w:r>
+                            <w:proofErr w:type="spellStart"/>
+                            <w:r>
+                              <w:rPr>
+                                <w:iCs/>
+                                <w:sz w:val="22"/>
+                                <w:szCs w:val="22"/>
+                              </w:rPr>
+                              <w:t>Yskout</w:t>
+                            </w:r>
+                            <w:proofErr w:type="spellEnd"/>
+                            <w:r>
+                              <w:rPr>
+                                <w:iCs/>
+                                <w:sz w:val="22"/>
+                                <w:szCs w:val="22"/>
+                              </w:rPr>
+                              <w:t xml:space="preserve"> (</w:t>
+                            </w:r>
+                            <w:proofErr w:type="spellStart"/>
+                            <w:r>
+                              <w:rPr>
+                                <w:iCs/>
+                                <w:sz w:val="22"/>
+                                <w:szCs w:val="22"/>
+                              </w:rPr>
+                              <w:t>KULeuven</w:t>
+                            </w:r>
+                            <w:proofErr w:type="spellEnd"/>
+                            <w:r>
+                              <w:rPr>
+                                <w:iCs/>
+                                <w:sz w:val="22"/>
+                                <w:szCs w:val="22"/>
+                              </w:rPr>
+                              <w:t xml:space="preserve">), Dr. Eva Geurts (EDM), </w:t>
+                            </w:r>
+                            <w:proofErr w:type="spellStart"/>
+                            <w:r>
+                              <w:rPr>
+                                <w:iCs/>
+                                <w:sz w:val="22"/>
+                                <w:szCs w:val="22"/>
+                              </w:rPr>
+                              <w:t>KULeuven</w:t>
+                            </w:r>
+                            <w:proofErr w:type="spellEnd"/>
+                            <w:r>
+                              <w:rPr>
+                                <w:iCs/>
+                                <w:sz w:val="22"/>
+                                <w:szCs w:val="22"/>
+                              </w:rPr>
+                              <w:t>/</w:t>
+                            </w:r>
+                            <w:proofErr w:type="spellStart"/>
+                            <w:r>
+                              <w:rPr>
+                                <w:iCs/>
+                                <w:sz w:val="22"/>
+                                <w:szCs w:val="22"/>
+                              </w:rPr>
+                              <w:t>UHasselt</w:t>
+                            </w:r>
+                            <w:proofErr w:type="spellEnd"/>
                           </w:p>
                           <w:p>
                             <w:pPr>
@@ -204,8 +268,72 @@
                           <w:sz w:val="22"/>
                           <w:szCs w:val="22"/>
                         </w:rPr>
-                        <w:t>Prof. dr. ir. Koen Yskout (KULeuven), Dr. Eva Geurts (EDM), KULeuven/UHasselt</w:t>
+                        <w:t xml:space="preserve">Prof. dr. ir. Koen </w:t>
                       </w:r>
+                      <w:proofErr w:type="spellStart"/>
+                      <w:r>
+                        <w:rPr>
+                          <w:iCs/>
+                          <w:sz w:val="22"/>
+                          <w:szCs w:val="22"/>
+                        </w:rPr>
+                        <w:t>Yskout</w:t>
+                      </w:r>
+                      <w:proofErr w:type="spellEnd"/>
+                      <w:r>
+                        <w:rPr>
+                          <w:iCs/>
+                          <w:sz w:val="22"/>
+                          <w:szCs w:val="22"/>
+                        </w:rPr>
+                        <w:t xml:space="preserve"> (</w:t>
+                      </w:r>
+                      <w:proofErr w:type="spellStart"/>
+                      <w:r>
+                        <w:rPr>
+                          <w:iCs/>
+                          <w:sz w:val="22"/>
+                          <w:szCs w:val="22"/>
+                        </w:rPr>
+                        <w:t>KULeuven</w:t>
+                      </w:r>
+                      <w:proofErr w:type="spellEnd"/>
+                      <w:r>
+                        <w:rPr>
+                          <w:iCs/>
+                          <w:sz w:val="22"/>
+                          <w:szCs w:val="22"/>
+                        </w:rPr>
+                        <w:t xml:space="preserve">), Dr. Eva Geurts (EDM), </w:t>
+                      </w:r>
+                      <w:proofErr w:type="spellStart"/>
+                      <w:r>
+                        <w:rPr>
+                          <w:iCs/>
+                          <w:sz w:val="22"/>
+                          <w:szCs w:val="22"/>
+                        </w:rPr>
+                        <w:t>KULeuven</w:t>
+                      </w:r>
+                      <w:proofErr w:type="spellEnd"/>
+                      <w:r>
+                        <w:rPr>
+                          <w:iCs/>
+                          <w:sz w:val="22"/>
+                          <w:szCs w:val="22"/>
+                        </w:rPr>
+                        <w:t>/</w:t>
+                      </w:r>
+                      <w:proofErr w:type="spellStart"/>
+                      <w:r>
+                        <w:rPr>
+                          <w:iCs/>
+                          <w:sz w:val="22"/>
+                          <w:szCs w:val="22"/>
+                        </w:rPr>
+                        <w:t>UHasselt</w:t>
+                      </w:r>
+                      <w:proofErr w:type="spellEnd"/>
                     </w:p>
                     <w:p>
                       <w:pPr>
@@ -323,7 +451,79 @@
                                 <w:sz w:val="56"/>
                                 <w:szCs w:val="56"/>
                               </w:rPr>
-                              <w:t>Ontwikkeling van een gebruiksvriendelijke threat modeling tool gebaseerd op fortunately/unfortunately methode</w:t>
+                              <w:t xml:space="preserve">Ontwikkeling van een gebruiksvriendelijke </w:t>
+                            </w:r>
+                            <w:proofErr w:type="spellStart"/>
+                            <w:r>
+                              <w:rPr>
+                                <w:i/>
+                                <w:sz w:val="56"/>
+                                <w:szCs w:val="56"/>
+                              </w:rPr>
+                              <w:t>threat</w:t>
+                            </w:r>
+                            <w:proofErr w:type="spellEnd"/>
+                            <w:r>
+                              <w:rPr>
+                                <w:i/>
+                                <w:sz w:val="56"/>
+                                <w:szCs w:val="56"/>
+                              </w:rPr>
+                              <w:t xml:space="preserve"> </w:t>
+                            </w:r>
+                            <w:proofErr w:type="spellStart"/>
+                            <w:r>
+                              <w:rPr>
+                                <w:i/>
+                                <w:sz w:val="56"/>
+                                <w:szCs w:val="56"/>
+                              </w:rPr>
+                              <w:t>modeling</w:t>
+                            </w:r>
+                            <w:proofErr w:type="spellEnd"/>
+                            <w:r>
+                              <w:rPr>
+                                <w:i/>
+                                <w:sz w:val="56"/>
+                                <w:szCs w:val="56"/>
+                              </w:rPr>
+                              <w:t xml:space="preserve"> tool gebaseerd op </w:t>
+                            </w:r>
+                            <w:proofErr w:type="spellStart"/>
+                            <w:r>
+                              <w:rPr>
+                                <w:i/>
+                                <w:sz w:val="56"/>
+                                <w:szCs w:val="56"/>
+                              </w:rPr>
+                              <w:t>fortunately</w:t>
+                            </w:r>
+                            <w:proofErr w:type="spellEnd"/>
+                            <w:r>
+                              <w:rPr>
+                                <w:i/>
+                                <w:sz w:val="56"/>
+                                <w:szCs w:val="56"/>
+                              </w:rPr>
+                              <w:t>/</w:t>
+                            </w:r>
+                            <w:proofErr w:type="spellStart"/>
+                            <w:r>
+                              <w:rPr>
+                                <w:i/>
+                                <w:sz w:val="56"/>
+                                <w:szCs w:val="56"/>
+                              </w:rPr>
+                              <w:t>unfortunately</w:t>
+                            </w:r>
+                            <w:proofErr w:type="spellEnd"/>
+                            <w:r>
+                              <w:rPr>
+                                <w:i/>
+                                <w:sz w:val="56"/>
+                                <w:szCs w:val="56"/>
+                              </w:rPr>
+                              <w:t xml:space="preserve"> methode</w:t>
                             </w:r>
                           </w:p>
                         </w:txbxContent>
@@ -370,7 +570,79 @@
                           <w:sz w:val="56"/>
                           <w:szCs w:val="56"/>
                         </w:rPr>
-                        <w:t>Ontwikkeling van een gebruiksvriendelijke threat modeling tool gebaseerd op fortunately/unfortunately methode</w:t>
+                        <w:t xml:space="preserve">Ontwikkeling van een gebruiksvriendelijke </w:t>
+                      </w:r>
+                      <w:proofErr w:type="spellStart"/>
+                      <w:r>
+                        <w:rPr>
+                          <w:i/>
+                          <w:sz w:val="56"/>
+                          <w:szCs w:val="56"/>
+                        </w:rPr>
+                        <w:t>threat</w:t>
+                      </w:r>
+                      <w:proofErr w:type="spellEnd"/>
+                      <w:r>
+                        <w:rPr>
+                          <w:i/>
+                          <w:sz w:val="56"/>
+                          <w:szCs w:val="56"/>
+                        </w:rPr>
+                        <w:t xml:space="preserve"> </w:t>
+                      </w:r>
+                      <w:proofErr w:type="spellStart"/>
+                      <w:r>
+                        <w:rPr>
+                          <w:i/>
+                          <w:sz w:val="56"/>
+                          <w:szCs w:val="56"/>
+                        </w:rPr>
+                        <w:t>modeling</w:t>
+                      </w:r>
+                      <w:proofErr w:type="spellEnd"/>
+                      <w:r>
+                        <w:rPr>
+                          <w:i/>
+                          <w:sz w:val="56"/>
+                          <w:szCs w:val="56"/>
+                        </w:rPr>
+                        <w:t xml:space="preserve"> tool gebaseerd op </w:t>
+                      </w:r>
+                      <w:proofErr w:type="spellStart"/>
+                      <w:r>
+                        <w:rPr>
+                          <w:i/>
+                          <w:sz w:val="56"/>
+                          <w:szCs w:val="56"/>
+                        </w:rPr>
+                        <w:t>fortunately</w:t>
+                      </w:r>
+                      <w:proofErr w:type="spellEnd"/>
+                      <w:r>
+                        <w:rPr>
+                          <w:i/>
+                          <w:sz w:val="56"/>
+                          <w:szCs w:val="56"/>
+                        </w:rPr>
+                        <w:t>/</w:t>
+                      </w:r>
+                      <w:proofErr w:type="spellStart"/>
+                      <w:r>
+                        <w:rPr>
+                          <w:i/>
+                          <w:sz w:val="56"/>
+                          <w:szCs w:val="56"/>
+                        </w:rPr>
+                        <w:t>unfortunately</w:t>
+                      </w:r>
+                      <w:proofErr w:type="spellEnd"/>
+                      <w:r>
+                        <w:rPr>
+                          <w:i/>
+                          <w:sz w:val="56"/>
+                          <w:szCs w:val="56"/>
+                        </w:rPr>
+                        <w:t xml:space="preserve"> methode</w:t>
                       </w:r>
                     </w:p>
                   </w:txbxContent>
@@ -475,15 +747,51 @@
       </w:r>
     </w:p>
     <w:p>
-      <w:r>
-        <w:t>Threat modeling blijft voor veel ontwikkelaars een complexe activiteit, waardoor risicoanalyse vaak onvolledig gebeurt. Dit onderzoek ontwikkelt en evalueert een gebruiksvriendelijke tool gebaseerd op de Fortunately-Unfortunately-methode met als doel het threat</w:t>
-      </w:r>
+      <w:proofErr w:type="spellStart"/>
+      <w:r>
+        <w:t>Threat</w:t>
+      </w:r>
+      <w:proofErr w:type="spellEnd"/>
       <w:r>
         <w:t xml:space="preserve"> </w:t>
       </w:r>
+      <w:proofErr w:type="spellStart"/>
       <w:r>
         <w:t>modeling</w:t>
       </w:r>
+      <w:proofErr w:type="spellEnd"/>
+      <w:r>
+        <w:t xml:space="preserve"> blijft voor veel ontwikkelaars een complexe activiteit, waardoor risicoanalyse vaak onvolledig gebeurt. Dit onderzoek ontwikkelt en evalueert een gebruiksvriendelijke tool gebaseerd op de </w:t>
+      </w:r>
+      <w:proofErr w:type="spellStart"/>
+      <w:r>
+        <w:t>Fortunately</w:t>
+      </w:r>
+      <w:proofErr w:type="spellEnd"/>
+      <w:r>
+        <w:t>-</w:t>
+      </w:r>
+      <w:proofErr w:type="spellStart"/>
+      <w:r>
+        <w:t>Unfortunately</w:t>
+      </w:r>
+      <w:proofErr w:type="spellEnd"/>
+      <w:r>
+        <w:t xml:space="preserve">-methode met als doel het </w:t>
+      </w:r>
+      <w:proofErr w:type="spellStart"/>
+      <w:r>
+        <w:t>threat</w:t>
+      </w:r>
+      <w:proofErr w:type="spellEnd"/>
+      <w:r>
+        <w:t xml:space="preserve"> </w:t>
+      </w:r>
+      <w:proofErr w:type="spellStart"/>
+      <w:r>
+        <w:t>modeling</w:t>
+      </w:r>
+      <w:proofErr w:type="spellEnd"/>
       <w:r>
         <w:t xml:space="preserve"> </w:t>
       </w:r>
@@ -493,14 +801,21 @@
     </w:p>
     <w:p>
       <w:r>
-        <w:t>Het onderzoek volgt een gestructureerde methode. Een literatuurstudie brengt bestaande threat</w:t>
-      </w:r>
+        <w:t xml:space="preserve">Het onderzoek volgt een gestructureerde methode. Een literatuurstudie brengt bestaande </w:t>
+      </w:r>
+      <w:proofErr w:type="spellStart"/>
+      <w:r>
+        <w:t>threat</w:t>
+      </w:r>
+      <w:proofErr w:type="spellEnd"/>
       <w:r>
         <w:t xml:space="preserve"> </w:t>
       </w:r>
+      <w:proofErr w:type="spellStart"/>
       <w:r>
         <w:t>modeling</w:t>
       </w:r>
+      <w:proofErr w:type="spellEnd"/>
       <w:r>
         <w:t xml:space="preserve"> </w:t>
       </w:r>
@@ -535,14 +850,48 @@
         <w:t>es</w:t>
       </w:r>
       <w:r>
-        <w:t xml:space="preserve"> als functies specifiek voor Fortunately-Unfortunately-treemodellering. Vervolgens wordt een webgebaseerd prototype ontworpen en ontwikkeld in React en D3, waarbij de boomstructuur wordt uitgebreid met zoek- en filterfuncties, visuele coderingen en ondersteunende interacties. De evaluatie gebeurt via een gebruikersonderzoek waarin deelnemers een scenario doorlopen, vooraf vastgelegde taken uitvoeren en hun ervaringen rapporteren via een open vragenlijst en een user</w:t>
+        <w:t xml:space="preserve"> als functies specifiek voor </w:t>
+      </w:r>
+      <w:proofErr w:type="spellStart"/>
+      <w:r>
+        <w:t>Fortunately</w:t>
+      </w:r>
+      <w:proofErr w:type="spellEnd"/>
+      <w:r>
+        <w:t>-</w:t>
+      </w:r>
+      <w:proofErr w:type="spellStart"/>
+      <w:r>
+        <w:t>Unfortunately</w:t>
+      </w:r>
+      <w:proofErr w:type="spellEnd"/>
+      <w:r>
+        <w:t xml:space="preserve">-treemodellering. Vervolgens wordt een </w:t>
+      </w:r>
+      <w:proofErr w:type="spellStart"/>
+      <w:r>
+        <w:t>webgebaseerd</w:t>
+      </w:r>
+      <w:proofErr w:type="spellEnd"/>
+      <w:r>
+        <w:t xml:space="preserve"> prototype ontworpen en ontwikkeld in </w:t>
+      </w:r>
+      <w:proofErr w:type="spellStart"/>
+      <w:r>
+        <w:t>React</w:t>
+      </w:r>
+      <w:proofErr w:type="spellEnd"/>
+      <w:r>
+        <w:t xml:space="preserve"> en D3, waarbij de boomstructuur wordt uitgebreid met zoek- en filterfuncties, visuele coderingen en ondersteunende interacties. De evaluatie gebeurt via een gebruikersonderzoek waarin deelnemers een scenario doorlopen, vooraf vastgelegde taken uitvoeren en hun ervaringen rapporteren via een open vragenlijst en een user</w:t>
       </w:r>
       <w:r>
         <w:t xml:space="preserve"> </w:t>
       </w:r>
+      <w:proofErr w:type="spellStart"/>
       <w:r>
         <w:t>experience</w:t>
       </w:r>
+      <w:proofErr w:type="spellEnd"/>
       <w:r>
         <w:t xml:space="preserve"> </w:t>
       </w:r>
@@ -552,8 +901,13 @@
     </w:p>
     <w:p>
       <w:r>
-        <w:t>De gerealiseerde tool bevat een interactieve boomstructuur met kleurcodering, statusiconen, een danger</w:t>
-      </w:r>
+        <w:t xml:space="preserve">De gerealiseerde tool bevat een interactieve boomstructuur met kleurcodering, statusiconen, een </w:t>
+      </w:r>
+      <w:proofErr w:type="spellStart"/>
+      <w:r>
+        <w:t>danger</w:t>
+      </w:r>
+      <w:proofErr w:type="spellEnd"/>
       <w:r>
         <w:t xml:space="preserve"> </w:t>
       </w:r>
@@ -567,11 +921,21 @@
         <w:t>mechanisme, zoek- en filterfuncties</w:t>
       </w:r>
       <w:r>
-        <w:t xml:space="preserve"> met node highlighting</w:t>
-      </w:r>
-      <w:r>
-        <w:t xml:space="preserve"> en educatieve ondersteuning via tooltips en parent</w:t>
-      </w:r>
+        <w:t xml:space="preserve"> met node </w:t>
+      </w:r>
+      <w:proofErr w:type="spellStart"/>
+      <w:r>
+        <w:t>highlighting</w:t>
+      </w:r>
+      <w:proofErr w:type="spellEnd"/>
+      <w:r>
+        <w:t xml:space="preserve"> en educatieve ondersteuning via tooltips en </w:t>
+      </w:r>
+      <w:proofErr w:type="spellStart"/>
+      <w:r>
+        <w:t>parent</w:t>
+      </w:r>
+      <w:proofErr w:type="spellEnd"/>
       <w:r>
         <w:t xml:space="preserve"> </w:t>
       </w:r>
@@ -588,9 +952,243 @@
         <w:t xml:space="preserve"> </w:t>
       </w:r>
       <w:r>
-        <w:t>software. De tool verhoogt de toegankelijkheid van threat modeling voor niet-experts en vormt een intuïtieve ondersteuning binnen het beveiligingsproces.</w:t>
+        <w:t xml:space="preserve">software. De tool verhoogt de toegankelijkheid van </w:t>
+      </w:r>
+      <w:proofErr w:type="spellStart"/>
+      <w:r>
+        <w:t>threat</w:t>
+      </w:r>
+      <w:proofErr w:type="spellEnd"/>
+      <w:r>
+        <w:t xml:space="preserve"> </w:t>
+      </w:r>
+      <w:proofErr w:type="spellStart"/>
+      <w:r>
+        <w:t>modeling</w:t>
+      </w:r>
+      <w:proofErr w:type="spellEnd"/>
+      <w:r>
+        <w:t xml:space="preserve"> voor niet-experts en vormt een intuïtieve ondersteuning binnen het beveiligingsproces.</w:t>
       </w:r>
     </w:p>
+    <w:p/>
+    <w:p>
+      <w:pPr>
+        <w:rPr>
+          <w:b/>
+          <w:bCs/>
+          <w:sz w:val="28"/>
+          <w:szCs w:val="28"/>
+        </w:rPr>
+      </w:pPr>
+      <w:r>
+        <w:rPr>
+          <w:b/>
+          <w:bCs/>
+          <w:sz w:val="28"/>
+          <w:szCs w:val="28"/>
+        </w:rPr>
+        <w:t>Nieuwe versie</w:t>
+      </w:r>
+    </w:p>
+    <w:p>
+      <w:proofErr w:type="spellStart"/>
+      <w:r>
+        <w:t>Threat</w:t>
+      </w:r>
+      <w:proofErr w:type="spellEnd"/>
+      <w:r>
+        <w:t xml:space="preserve"> </w:t>
+      </w:r>
+      <w:proofErr w:type="spellStart"/>
+      <w:r>
+        <w:t>modeling</w:t>
+      </w:r>
+      <w:proofErr w:type="spellEnd"/>
+      <w:r>
+        <w:t xml:space="preserve"> is een systematische methode binnen softwareontwikkeling om potentiële beveiligingsrisico’s vroegtijdig te identificeren en te mitigeren. Ondanks het belang ervan ervaren veel ontwikkelaars het proces als complex en tijdsintensief, wat vaak leidt tot onvolledige risicoanalyses. Dit onderzoek ontwikkelt en evalueert een gebruiksvriendelijke tool, gebaseerd op de </w:t>
+      </w:r>
+      <w:proofErr w:type="spellStart"/>
+      <w:r>
+        <w:t>Fortunately</w:t>
+      </w:r>
+      <w:proofErr w:type="spellEnd"/>
+      <w:r>
+        <w:t>-</w:t>
+      </w:r>
+      <w:proofErr w:type="spellStart"/>
+      <w:r>
+        <w:t>Unfortunately</w:t>
+      </w:r>
+      <w:proofErr w:type="spellEnd"/>
+      <w:r>
+        <w:t xml:space="preserve">-methode, om het </w:t>
+      </w:r>
+      <w:proofErr w:type="spellStart"/>
+      <w:r>
+        <w:t>threat</w:t>
+      </w:r>
+      <w:proofErr w:type="spellEnd"/>
+      <w:r>
+        <w:t xml:space="preserve"> </w:t>
+      </w:r>
+      <w:proofErr w:type="spellStart"/>
+      <w:r>
+        <w:t>modeling</w:t>
+      </w:r>
+      <w:proofErr w:type="spellEnd"/>
+      <w:r>
+        <w:t>-proces toegankelijker en effectiever te maken.</w:t>
+      </w:r>
+    </w:p>
+    <w:p>
+      <w:r>
+        <w:t xml:space="preserve">Een literatuurstudie brengt bestaande </w:t>
+      </w:r>
+      <w:proofErr w:type="spellStart"/>
+      <w:r>
+        <w:t>threat</w:t>
+      </w:r>
+      <w:proofErr w:type="spellEnd"/>
+      <w:r>
+        <w:t xml:space="preserve"> </w:t>
+      </w:r>
+      <w:proofErr w:type="spellStart"/>
+      <w:r>
+        <w:t>modeling</w:t>
+      </w:r>
+      <w:proofErr w:type="spellEnd"/>
+      <w:r>
+        <w:t xml:space="preserve">-raamwerken, </w:t>
+      </w:r>
+      <w:proofErr w:type="spellStart"/>
+      <w:r>
+        <w:t>mindmaptools</w:t>
+      </w:r>
+      <w:proofErr w:type="spellEnd"/>
+      <w:r>
+        <w:t xml:space="preserve"> en visualisatietechnieken in kaart. Op basis daarvan wordt een eisenlijst opgesteld met zowel generieke functies als mogelijkheden specifiek voor </w:t>
+      </w:r>
+      <w:proofErr w:type="spellStart"/>
+      <w:r>
+        <w:t>Fortunately</w:t>
+      </w:r>
+      <w:proofErr w:type="spellEnd"/>
+      <w:r>
+        <w:t>-</w:t>
+      </w:r>
+      <w:proofErr w:type="spellStart"/>
+      <w:r>
+        <w:t>Unfortunately</w:t>
+      </w:r>
+      <w:proofErr w:type="spellEnd"/>
+      <w:r>
+        <w:t xml:space="preserve">-treemodellering. Vervolgens wordt een </w:t>
+      </w:r>
+      <w:proofErr w:type="spellStart"/>
+      <w:r>
+        <w:t>webgebaseerd</w:t>
+      </w:r>
+      <w:proofErr w:type="spellEnd"/>
+      <w:r>
+        <w:t xml:space="preserve"> prototype ontwikkeld in </w:t>
+      </w:r>
+      <w:proofErr w:type="spellStart"/>
+      <w:r>
+        <w:t>React</w:t>
+      </w:r>
+      <w:proofErr w:type="spellEnd"/>
+      <w:r>
+        <w:t xml:space="preserve"> en D3, uitgebreid met zoek- en filterfuncties, visuele coderingen en ondersteunende interacties. De tool wordt geëvalueerd via een gebruikersonderzoek met negen </w:t>
+      </w:r>
+      <w:r>
+        <w:lastRenderedPageBreak/>
+        <w:t xml:space="preserve">deelnemers, die een scenario doorlopen, taken uitvoeren en hun ervaring rapporteren via een open vragenlijst en de User </w:t>
+      </w:r>
+      <w:proofErr w:type="spellStart"/>
+      <w:r>
+        <w:t>Experience</w:t>
+      </w:r>
+      <w:proofErr w:type="spellEnd"/>
+      <w:r>
+        <w:t xml:space="preserve"> Questionnaire (UEQ).</w:t>
+      </w:r>
+    </w:p>
+    <w:p>
+      <w:r>
+        <w:t xml:space="preserve">De resultaten tonen een duidelijke verbetering in gebruiksvriendelijkheid ten opzichte van generieke </w:t>
+      </w:r>
+      <w:proofErr w:type="spellStart"/>
+      <w:r>
+        <w:t>mindmapsoftware</w:t>
+      </w:r>
+      <w:proofErr w:type="spellEnd"/>
+      <w:r>
+        <w:t>, met positieve UEQ-scores op alle dimensies (aantrekkelijkheid</w:t>
+      </w:r>
+      <w:r>
+        <w:rPr>
+          <w:rFonts w:ascii="Arial" w:hAnsi="Arial" w:cs="Arial"/>
+        </w:rPr>
+        <w:t> </w:t>
+      </w:r>
+      <w:r>
+        <w:t>+1.2, effici</w:t>
+      </w:r>
+      <w:r>
+        <w:rPr>
+          <w:rFonts w:ascii="Aptos" w:hAnsi="Aptos" w:cs="Aptos"/>
+        </w:rPr>
+        <w:t>ë</w:t>
+      </w:r>
+      <w:r>
+        <w:t>ntie</w:t>
+      </w:r>
+      <w:r>
+        <w:rPr>
+          <w:rFonts w:ascii="Arial" w:hAnsi="Arial" w:cs="Arial"/>
+        </w:rPr>
+        <w:t> </w:t>
+      </w:r>
+      <w:r>
+        <w:t>+1.5, stimulatie</w:t>
+      </w:r>
+      <w:r>
+        <w:rPr>
+          <w:rFonts w:ascii="Arial" w:hAnsi="Arial" w:cs="Arial"/>
+        </w:rPr>
+        <w:t> </w:t>
+      </w:r>
+      <w:r>
+        <w:t xml:space="preserve">+2.1) tegenover negatieve scores voor de basisversie. De tool verhoogt zo de toegankelijkheid van </w:t>
+      </w:r>
+      <w:proofErr w:type="spellStart"/>
+      <w:r>
+        <w:t>threat</w:t>
+      </w:r>
+      <w:proofErr w:type="spellEnd"/>
+      <w:r>
+        <w:t xml:space="preserve"> </w:t>
+      </w:r>
+      <w:proofErr w:type="spellStart"/>
+      <w:r>
+        <w:t>modeling</w:t>
+      </w:r>
+      <w:proofErr w:type="spellEnd"/>
+      <w:r>
+        <w:t xml:space="preserve"> voor niet-experts en biedt intu</w:t>
+      </w:r>
+      <w:r>
+        <w:rPr>
+          <w:rFonts w:ascii="Aptos" w:hAnsi="Aptos" w:cs="Aptos"/>
+        </w:rPr>
+        <w:t>ï</w:t>
+      </w:r>
+      <w:r>
+        <w:t>tieve ondersteuning binnen het beveiligingsproces.</w:t>
+      </w:r>
+    </w:p>
+    <w:p/>
     <w:p>
       <w:r>
         <w:br w:type="page"/>
@@ -735,6 +1333,151 @@
           <w:lang w:val="en-US"/>
         </w:rPr>
       </w:pPr>
+    </w:p>
+    <w:p>
+      <w:pPr>
+        <w:rPr>
+          <w:b/>
+          <w:bCs/>
+          <w:sz w:val="28"/>
+          <w:szCs w:val="28"/>
+          <w:lang w:val="en-US"/>
+        </w:rPr>
+      </w:pPr>
+      <w:r>
+        <w:rPr>
+          <w:b/>
+          <w:bCs/>
+          <w:sz w:val="28"/>
+          <w:szCs w:val="28"/>
+          <w:lang w:val="en-US"/>
+        </w:rPr>
+        <w:t>New version</w:t>
+      </w:r>
+    </w:p>
+    <w:p>
+      <w:pPr>
+        <w:rPr>
+          <w:lang w:val="en-GB"/>
+        </w:rPr>
+      </w:pPr>
+      <w:r>
+        <w:rPr>
+          <w:lang w:val="en-GB"/>
+        </w:rPr>
+        <w:t xml:space="preserve">Threat </w:t>
+      </w:r>
+      <w:proofErr w:type="spellStart"/>
+      <w:r>
+        <w:rPr>
+          <w:lang w:val="en-GB"/>
+        </w:rPr>
+        <w:t>modeling</w:t>
+      </w:r>
+      <w:proofErr w:type="spellEnd"/>
+      <w:r>
+        <w:rPr>
+          <w:lang w:val="en-GB"/>
+        </w:rPr>
+        <w:t xml:space="preserve"> is a systematic method in software development used to identify and address potential security risks at an early stage. Despite its importance, threat </w:t>
+      </w:r>
+      <w:proofErr w:type="spellStart"/>
+      <w:r>
+        <w:rPr>
+          <w:lang w:val="en-GB"/>
+        </w:rPr>
+        <w:t>modeling</w:t>
+      </w:r>
+      <w:proofErr w:type="spellEnd"/>
+      <w:r>
+        <w:rPr>
+          <w:lang w:val="en-GB"/>
+        </w:rPr>
+        <w:t xml:space="preserve"> remains a complex and time-consuming activity for many developers, often resulting in incomplete risk analyses. This study develops and evaluates a user-friendly tool based on the Fortunately–Unfortunately method, aiming to make the threat </w:t>
+      </w:r>
+      <w:proofErr w:type="spellStart"/>
+      <w:r>
+        <w:rPr>
+          <w:lang w:val="en-GB"/>
+        </w:rPr>
+        <w:t>modeling</w:t>
+      </w:r>
+      <w:proofErr w:type="spellEnd"/>
+      <w:r>
+        <w:rPr>
+          <w:lang w:val="en-GB"/>
+        </w:rPr>
+        <w:t xml:space="preserve"> process more accessible and effective.</w:t>
+      </w:r>
+    </w:p>
+    <w:p>
+      <w:pPr>
+        <w:rPr>
+          <w:lang w:val="en-GB"/>
+        </w:rPr>
+      </w:pPr>
+      <w:r>
+        <w:rPr>
+          <w:lang w:val="en-GB"/>
+        </w:rPr>
+        <w:t xml:space="preserve">The research follows a structured approach. A literature review maps existing threat </w:t>
+      </w:r>
+      <w:proofErr w:type="spellStart"/>
+      <w:r>
+        <w:rPr>
+          <w:lang w:val="en-GB"/>
+        </w:rPr>
+        <w:t>modeling</w:t>
+      </w:r>
+      <w:proofErr w:type="spellEnd"/>
+      <w:r>
+        <w:rPr>
+          <w:lang w:val="en-GB"/>
+        </w:rPr>
+        <w:t xml:space="preserve"> frameworks, mind mapping tools, and visualization techniques. Based on these findings, a list of requirements is established, including both basic functions and features specific to Fortunately–Unfortunately tree </w:t>
+      </w:r>
+      <w:proofErr w:type="spellStart"/>
+      <w:r>
+        <w:rPr>
+          <w:lang w:val="en-GB"/>
+        </w:rPr>
+        <w:t>modeling</w:t>
+      </w:r>
+      <w:proofErr w:type="spellEnd"/>
+      <w:r>
+        <w:rPr>
+          <w:lang w:val="en-GB"/>
+        </w:rPr>
+        <w:t>. Subsequently, a web-based prototype is designed and implemented using React and D3, extending the tree structure with search and filter functionalities, visual encodings, and supportive interactions. The evaluation is conducted through a user study with nine participants, in which they complete a predefined scenario, perform specific tasks, and report their experiences using an open questionnaire and a user experience survey.</w:t>
+      </w:r>
+    </w:p>
+    <w:p>
+      <w:pPr>
+        <w:rPr>
+          <w:lang w:val="en-GB"/>
+        </w:rPr>
+      </w:pPr>
+      <w:r>
+        <w:rPr>
+          <w:lang w:val="en-GB"/>
+        </w:rPr>
+        <w:lastRenderedPageBreak/>
+        <w:t xml:space="preserve">The results show a clear improvement in clarity, navigability, and usability compared to generic mind mapping software. The tool enhances the accessibility of threat </w:t>
+      </w:r>
+      <w:proofErr w:type="spellStart"/>
+      <w:r>
+        <w:rPr>
+          <w:lang w:val="en-GB"/>
+        </w:rPr>
+        <w:t>modeling</w:t>
+      </w:r>
+      <w:proofErr w:type="spellEnd"/>
+      <w:r>
+        <w:rPr>
+          <w:lang w:val="en-GB"/>
+        </w:rPr>
+        <w:t xml:space="preserve"> for non-experts and provides intuitive support within the security analysis process</w:t>
+      </w:r>
     </w:p>
     <w:sectPr>
       <w:pgSz w:w="11906" w:h="16838"/>
@@ -1349,7 +2092,6 @@
   <w:style w:type="character" w:default="1" w:styleId="Standaardalinea-lettertype">
     <w:name w:val="Default Paragraph Font"/>
     <w:uiPriority w:val="1"/>
-    <w:semiHidden/>
     <w:unhideWhenUsed/>
   </w:style>
   <w:style w:type="table" w:default="1" w:styleId="Standaardtabel">

</xml_diff>